<commit_message>
8th commit - GBookink api services and controllers
</commit_message>
<xml_diff>
--- a/פרויקט[1] (שוחזר אוטומטית).docx
+++ b/פרויקט[1] (שוחזר אוטומטית).docx
@@ -76,8 +76,10 @@
           <w:rFonts w:hint="cs"/>
           <w:rtl/>
         </w:rPr>
-        <w:t>חנין חטיב , פארוק, סגא, מחמוד</w:t>
-      </w:r>
+        <w:t>חנין חטיב, פארוק, סגא</w:t>
+      </w:r>
+      <w:bookmarkStart w:id="0" w:name="_GoBack"/>
+      <w:bookmarkEnd w:id="0"/>
     </w:p>
     <w:p>
       <w:pPr>
@@ -1724,7 +1726,6 @@
     <w:p>
       <w:pPr>
         <w:rPr>
-          <w:rFonts w:hint="cs"/>
           <w:rtl/>
           <w:lang w:val="en-GB"/>
         </w:rPr>
@@ -1924,12 +1925,7 @@
         <w:t>Frontend:</w:t>
       </w:r>
       <w:r>
-        <w:t xml:space="preserve"> React, [Materia</w:t>
-      </w:r>
-      <w:bookmarkStart w:id="0" w:name="_GoBack"/>
-      <w:bookmarkEnd w:id="0"/>
-      <w:r>
-        <w:t>l UI / Tailwind CSS]</w:t>
+        <w:t xml:space="preserve"> React, [Material UI / Tailwind CSS]</w:t>
       </w:r>
       <w:r>
         <w:rPr>

</xml_diff>